<commit_message>
Correct overstated Zendesk claim (Josh flagged it) - score 58 -> 55
Josh's actual Zendesk experience is comparative/sales-side demo work
(showing what a workflow would look like in Zendesk vs. another
system), not hands-on day-to-day ticket-queue/support-agent use. The
Bilgewater Group resume claimed the latter. Corrected in
master-profile.md with a scoped note (role attribution still not
captured), removed Zendesk from that resume's summary and
competencies, and now lean on Josh's genuinely operational
case-tracking experience in HubSpot, Salesforce, GoHighLevel, and
Jira instead. Rescored must-haves 36->33, total 58->55, same Long
shot band.

Co-Authored-By: Claude Sonnet 5 <noreply@anthropic.com>
Claude-Session: https://claude.ai/code/session_01NbVZsCcsxhZmD6mekvh8hj
</commit_message>
<xml_diff>
--- a/applications/bilgewater-group-technical-support-tier1/Bilgewater-Group-Technical-Support-Tier1-Resume.docx
+++ b/applications/bilgewater-group-technical-support-tier1/Bilgewater-Group-Technical-Support-Tier1-Resume.docx
@@ -80,7 +80,7 @@
           <w:i w:val="0"/>
           <w:color w:val="1A1A1A"/>
         </w:rPr>
-        <w:t>Client-facing technical support professional with 15+ years troubleshooting, configuring, and resolving technical issues for SaaS clients, using Zendesk and other ticketing systems to track and close first-line and escalated requests. Explains technical concepts clearly to non-technical users and documents solutions and internal playbooks as a standing practice. Comfortable working independently and reliably in a fully remote environment.</w:t>
+        <w:t>Client-facing technical support professional with 15+ years troubleshooting, configuring, and resolving technical issues for SaaS clients, tracking cases and client records in CRM and project-management systems including HubSpot, Salesforce, GoHighLevel, and Jira. Explains technical concepts clearly to non-technical users and documents solutions and internal playbooks as a standing practice. Comfortable working independently and reliably in a fully remote environment.</w:t>
       </w:r>
     </w:p>
     <w:p>
@@ -328,30 +328,6 @@
           <w:color w:val="1A1A1A"/>
         </w:rPr>
         <w:t>Collaborated with Product and Engineering to escalate and resolve structured, high-priority customer issues.</w:t>
-      </w:r>
-    </w:p>
-    <w:p>
-      <w:pPr>
-        <w:spacing w:after="30"/>
-        <w:ind w:left="259" w:hanging="259"/>
-      </w:pPr>
-      <w:r>
-        <w:rPr>
-          <w:rFonts w:ascii="Calibri" w:hAnsi="Calibri"/>
-          <w:b w:val="0"/>
-          <w:i w:val="0"/>
-          <w:color w:val="163A5F"/>
-        </w:rPr>
-        <w:t xml:space="preserve">•  </w:t>
-      </w:r>
-      <w:r>
-        <w:rPr>
-          <w:rFonts w:ascii="Calibri" w:hAnsi="Calibri"/>
-          <w:b w:val="0"/>
-          <w:i w:val="0"/>
-          <w:color w:val="1A1A1A"/>
-        </w:rPr>
-        <w:t>Analyzed partner utilization and performance metrics to identify adoption gaps and recommend interventions that reduced churn.</w:t>
       </w:r>
     </w:p>
     <w:p>
@@ -698,7 +674,7 @@
           <w:i w:val="0"/>
           <w:color w:val="1A1A1A"/>
         </w:rPr>
-        <w:t>Zendesk, Jira, HubSpot, Salesforce, GoHighLevel</w:t>
+        <w:t>Jira, HubSpot, Salesforce, GoHighLevel</w:t>
       </w:r>
     </w:p>
     <w:p>

</xml_diff>